<commit_message>
Update Notat, Ny struktur for OS2-Skadesøkonomi.docx
</commit_message>
<xml_diff>
--- a/Notat, Ny struktur for OS2-Skadesøkonomi.docx
+++ b/Notat, Ny struktur for OS2-Skadesøkonomi.docx
@@ -4,9 +4,9 @@
   <w:body>
     <w:p>
       <w:pPr>
-        <w:pStyle w:val="Overskrift1"/>
-        <w:rPr>
-          <w:rStyle w:val="Strk"/>
+        <w:pStyle w:val="Heading1"/>
+        <w:rPr>
+          <w:rStyle w:val="Strong"/>
           <w:lang w:val="da-DK"/>
         </w:rPr>
       </w:pPr>
@@ -67,14 +67,14 @@
       </w:pPr>
       <w:r>
         <w:rPr>
-          <w:rStyle w:val="Overskrift2Tegn"/>
+          <w:rStyle w:val="Heading2Char"/>
           <w:lang w:val="da-DK"/>
         </w:rPr>
         <w:t>Indledning</w:t>
       </w:r>
       <w:r>
         <w:rPr>
-          <w:rStyle w:val="Overskrift2Tegn"/>
+          <w:rStyle w:val="Heading2Char"/>
           <w:lang w:val="da-DK"/>
         </w:rPr>
         <w:br/>
@@ -277,7 +277,7 @@
     </w:p>
     <w:p>
       <w:pPr>
-        <w:pStyle w:val="Listeafsnit"/>
+        <w:pStyle w:val="ListParagraph"/>
         <w:numPr>
           <w:ilvl w:val="0"/>
           <w:numId w:val="41"/>
@@ -374,7 +374,7 @@
     </w:p>
     <w:p>
       <w:pPr>
-        <w:pStyle w:val="Listeafsnit"/>
+        <w:pStyle w:val="ListParagraph"/>
         <w:numPr>
           <w:ilvl w:val="0"/>
           <w:numId w:val="41"/>
@@ -423,7 +423,7 @@
     </w:p>
     <w:p>
       <w:pPr>
-        <w:pStyle w:val="Listeafsnit"/>
+        <w:pStyle w:val="ListParagraph"/>
         <w:numPr>
           <w:ilvl w:val="0"/>
           <w:numId w:val="41"/>
@@ -441,7 +441,7 @@
     </w:p>
     <w:p>
       <w:pPr>
-        <w:pStyle w:val="Listeafsnit"/>
+        <w:pStyle w:val="ListParagraph"/>
         <w:numPr>
           <w:ilvl w:val="0"/>
           <w:numId w:val="41"/>
@@ -574,7 +574,7 @@
     </w:p>
     <w:p>
       <w:pPr>
-        <w:pStyle w:val="Listeafsnit"/>
+        <w:pStyle w:val="ListParagraph"/>
         <w:numPr>
           <w:ilvl w:val="0"/>
           <w:numId w:val="41"/>
@@ -788,7 +788,7 @@
     </w:p>
     <w:p>
       <w:pPr>
-        <w:pStyle w:val="Listeafsnit"/>
+        <w:pStyle w:val="ListParagraph"/>
         <w:numPr>
           <w:ilvl w:val="0"/>
           <w:numId w:val="32"/>
@@ -1035,7 +1035,7 @@
     </w:p>
     <w:p>
       <w:pPr>
-        <w:pStyle w:val="Listeafsnit"/>
+        <w:pStyle w:val="ListParagraph"/>
         <w:numPr>
           <w:ilvl w:val="0"/>
           <w:numId w:val="32"/>
@@ -1204,7 +1204,7 @@
     </w:p>
     <w:p>
       <w:pPr>
-        <w:pStyle w:val="Listeafsnit"/>
+        <w:pStyle w:val="ListParagraph"/>
         <w:numPr>
           <w:ilvl w:val="0"/>
           <w:numId w:val="32"/>
@@ -1306,7 +1306,7 @@
     </w:p>
     <w:p>
       <w:pPr>
-        <w:pStyle w:val="Listeafsnit"/>
+        <w:pStyle w:val="ListParagraph"/>
         <w:numPr>
           <w:ilvl w:val="0"/>
           <w:numId w:val="32"/>
@@ -1438,7 +1438,7 @@
     </w:p>
     <w:p>
       <w:pPr>
-        <w:pStyle w:val="Overskrift2"/>
+        <w:pStyle w:val="Heading2"/>
         <w:rPr>
           <w:lang w:val="da-DK"/>
         </w:rPr>
@@ -1531,21 +1531,21 @@
       </w:pPr>
       <w:r>
         <w:rPr>
-          <w:rStyle w:val="Overskrift4Tegn"/>
+          <w:rStyle w:val="Heading4Char"/>
           <w:lang w:val="da-DK"/>
         </w:rPr>
         <w:t>SQL</w:t>
       </w:r>
       <w:r>
         <w:rPr>
-          <w:rStyle w:val="Overskrift4Tegn"/>
+          <w:rStyle w:val="Heading4Char"/>
           <w:lang w:val="da-DK"/>
         </w:rPr>
         <w:t>-</w:t>
       </w:r>
       <w:r>
         <w:rPr>
-          <w:rStyle w:val="Overskrift4Tegn"/>
+          <w:rStyle w:val="Heading4Char"/>
           <w:lang w:val="da-DK"/>
         </w:rPr>
         <w:t>skabeloner og tokens</w:t>
@@ -1609,7 +1609,7 @@
     </w:p>
     <w:p>
       <w:pPr>
-        <w:pStyle w:val="Listeafsnit"/>
+        <w:pStyle w:val="ListParagraph"/>
         <w:numPr>
           <w:ilvl w:val="0"/>
           <w:numId w:val="35"/>
@@ -1620,16 +1620,36 @@
       </w:pPr>
       <w:r>
         <w:rPr>
-          <w:lang w:val="da-DK"/>
-        </w:rPr>
-        <w:t xml:space="preserve">Sektordata, som er tabeller, der indeholder entiteter, hvor der </w:t>
-      </w:r>
-      <w:r>
-        <w:rPr>
           <w:i/>
           <w:iCs/>
           <w:lang w:val="da-DK"/>
         </w:rPr>
+        <w:t>Sektordata</w:t>
+      </w:r>
+      <w:r>
+        <w:rPr>
+          <w:lang w:val="da-DK"/>
+        </w:rPr>
+        <w:t>, som er tabeller, der indeholder entiteter, hvor</w:t>
+      </w:r>
+      <w:r>
+        <w:rPr>
+          <w:lang w:val="da-DK"/>
+        </w:rPr>
+        <w:t>til</w:t>
+      </w:r>
+      <w:r>
+        <w:rPr>
+          <w:lang w:val="da-DK"/>
+        </w:rPr>
+        <w:t xml:space="preserve"> der </w:t>
+      </w:r>
+      <w:r>
+        <w:rPr>
+          <w:i/>
+          <w:iCs/>
+          <w:lang w:val="da-DK"/>
+        </w:rPr>
         <w:t>beregnes</w:t>
       </w:r>
       <w:r>
@@ -1647,7 +1667,7 @@
     </w:p>
     <w:p>
       <w:pPr>
-        <w:pStyle w:val="Listeafsnit"/>
+        <w:pStyle w:val="ListParagraph"/>
         <w:numPr>
           <w:ilvl w:val="0"/>
           <w:numId w:val="35"/>
@@ -1658,21 +1678,33 @@
       </w:pPr>
       <w:r>
         <w:rPr>
+          <w:i/>
+          <w:iCs/>
           <w:lang w:val="da-DK"/>
         </w:rPr>
         <w:t>Oversvømmelse</w:t>
       </w:r>
       <w:r>
         <w:rPr>
+          <w:i/>
+          <w:iCs/>
           <w:lang w:val="da-DK"/>
         </w:rPr>
         <w:t>s</w:t>
       </w:r>
       <w:r>
         <w:rPr>
-          <w:lang w:val="da-DK"/>
-        </w:rPr>
-        <w:t>data, som er tabeller, der indeholder oversvømmelses data - fladedækkende polygoner med oversvømmelseshøjder – én tabel pr. oversvømmelse</w:t>
+          <w:i/>
+          <w:iCs/>
+          <w:lang w:val="da-DK"/>
+        </w:rPr>
+        <w:t>data</w:t>
+      </w:r>
+      <w:r>
+        <w:rPr>
+          <w:lang w:val="da-DK"/>
+        </w:rPr>
+        <w:t>, som er tabeller, der indeholder oversvømmelses data - fladedækkende polygoner med oversvømmelseshøjder – én tabel pr. oversvømmelse</w:t>
       </w:r>
       <w:r>
         <w:rPr>
@@ -1701,7 +1733,7 @@
     </w:p>
     <w:p>
       <w:pPr>
-        <w:pStyle w:val="Listeafsnit"/>
+        <w:pStyle w:val="ListParagraph"/>
         <w:numPr>
           <w:ilvl w:val="0"/>
           <w:numId w:val="35"/>
@@ -1712,9 +1744,17 @@
       </w:pPr>
       <w:r>
         <w:rPr>
-          <w:lang w:val="da-DK"/>
-        </w:rPr>
-        <w:t>Opslagsdata, som er tabeller, som indeholder data om omkostningstal baseret på forskellige parametre, såsom bygningsareal, bygningstype, person alder, turismetyper osv.</w:t>
+          <w:i/>
+          <w:iCs/>
+          <w:lang w:val="da-DK"/>
+        </w:rPr>
+        <w:t>Opslagsdata</w:t>
+      </w:r>
+      <w:r>
+        <w:rPr>
+          <w:lang w:val="da-DK"/>
+        </w:rPr>
+        <w:t>, som er tabeller, som indeholder data om omkostningstal baseret på forskellige parametre, såsom bygningsareal, bygningstype, person alder, turismetyper osv.</w:t>
       </w:r>
       <w:r>
         <w:rPr>
@@ -1725,7 +1765,7 @@
     </w:p>
     <w:p>
       <w:pPr>
-        <w:pStyle w:val="Listeafsnit"/>
+        <w:pStyle w:val="ListParagraph"/>
         <w:numPr>
           <w:ilvl w:val="0"/>
           <w:numId w:val="35"/>
@@ -1736,9 +1776,17 @@
       </w:pPr>
       <w:r>
         <w:rPr>
-          <w:lang w:val="da-DK"/>
-        </w:rPr>
-        <w:t>En parameter tabel, som indeholder alle øvrige enkeltstående parameterværdier. Hver parameter identificeres ved et unikt navn, type, værdiområde, gruppetilhørsforhold o.lign.</w:t>
+          <w:i/>
+          <w:iCs/>
+          <w:lang w:val="da-DK"/>
+        </w:rPr>
+        <w:t>En parameter tabel</w:t>
+      </w:r>
+      <w:r>
+        <w:rPr>
+          <w:lang w:val="da-DK"/>
+        </w:rPr>
+        <w:t>, som indeholder alle øvrige enkeltstående parameterværdier. Hver parameter identificeres ved et unikt navn, type, værdiområde, gruppetilhørsforhold o.lign.</w:t>
       </w:r>
       <w:r>
         <w:rPr>
@@ -1939,7 +1987,7 @@
     </w:p>
     <w:p>
       <w:pPr>
-        <w:pStyle w:val="Listeafsnit"/>
+        <w:pStyle w:val="ListParagraph"/>
         <w:numPr>
           <w:ilvl w:val="0"/>
           <w:numId w:val="14"/>
@@ -1956,14 +2004,14 @@
       </w:r>
       <w:r>
         <w:rPr>
-          <w:rStyle w:val="Bogenstitel"/>
+          <w:rStyle w:val="BookTitle"/>
           <w:lang w:val="da-DK"/>
         </w:rPr>
         <w:t>”SELECT bbr_nr, bbr_anvendelse from bygninger_dk”</w:t>
       </w:r>
       <w:r>
         <w:rPr>
-          <w:rStyle w:val="Bogenstitel"/>
+          <w:rStyle w:val="BookTitle"/>
           <w:lang w:val="da-DK"/>
         </w:rPr>
         <w:br/>
@@ -2001,13 +2049,13 @@
     </w:p>
     <w:p>
       <w:pPr>
-        <w:pStyle w:val="Listeafsnit"/>
+        <w:pStyle w:val="ListParagraph"/>
         <w:numPr>
           <w:ilvl w:val="0"/>
           <w:numId w:val="14"/>
         </w:numPr>
         <w:rPr>
-          <w:rStyle w:val="Bogenstitel"/>
+          <w:rStyle w:val="BookTitle"/>
           <w:b w:val="0"/>
           <w:bCs w:val="0"/>
           <w:i w:val="0"/>
@@ -2072,7 +2120,7 @@
       </w:r>
       <w:r>
         <w:rPr>
-          <w:rStyle w:val="Bogenstitel"/>
+          <w:rStyle w:val="BookTitle"/>
           <w:lang w:val="da-DK"/>
         </w:rPr>
         <w:t>“SELECT {build_code}, {build_use} from {build_table}”</w:t>
@@ -2080,7 +2128,7 @@
     </w:p>
     <w:p>
       <w:pPr>
-        <w:pStyle w:val="Listeafsnit"/>
+        <w:pStyle w:val="ListParagraph"/>
         <w:ind w:left="410"/>
         <w:rPr>
           <w:lang w:val="da-DK"/>
@@ -2124,7 +2172,7 @@
       </w:r>
       <w:r>
         <w:rPr>
-          <w:rStyle w:val="Bogenstitel"/>
+          <w:rStyle w:val="BookTitle"/>
           <w:lang w:val="da-DK"/>
         </w:rPr>
         <w:t>{build_code} -&gt; bbr_nr</w:t>
@@ -2143,7 +2191,7 @@
       </w:r>
       <w:r>
         <w:rPr>
-          <w:rStyle w:val="Bogenstitel"/>
+          <w:rStyle w:val="BookTitle"/>
           <w:lang w:val="da-DK"/>
         </w:rPr>
         <w:t>{build_use} -&gt; bbr_anvendelse</w:t>
@@ -2162,14 +2210,14 @@
       </w:r>
       <w:r>
         <w:rPr>
-          <w:rStyle w:val="Bogenstitel"/>
+          <w:rStyle w:val="BookTitle"/>
           <w:lang w:val="da-DK"/>
         </w:rPr>
         <w:t>{build_table} -&gt; bygninger_dk.</w:t>
       </w:r>
       <w:r>
         <w:rPr>
-          <w:rStyle w:val="Bogenstitel"/>
+          <w:rStyle w:val="BookTitle"/>
           <w:lang w:val="da-DK"/>
         </w:rPr>
         <w:br/>
@@ -2177,7 +2225,7 @@
     </w:p>
     <w:p>
       <w:pPr>
-        <w:pStyle w:val="Listeafsnit"/>
+        <w:pStyle w:val="ListParagraph"/>
         <w:ind w:left="410"/>
         <w:rPr>
           <w:lang w:val="da-DK"/>
@@ -2469,21 +2517,21 @@
       </w:pPr>
       <w:r>
         <w:rPr>
-          <w:rStyle w:val="Overskrift4Tegn"/>
+          <w:rStyle w:val="Heading4Char"/>
           <w:lang w:val="da-DK"/>
         </w:rPr>
         <w:t>D</w:t>
       </w:r>
       <w:r>
         <w:rPr>
-          <w:rStyle w:val="Overskrift4Tegn"/>
+          <w:rStyle w:val="Heading4Char"/>
           <w:lang w:val="da-DK"/>
         </w:rPr>
         <w:t>atabasemodel for OS2-Skadesøkonomi</w:t>
       </w:r>
       <w:r>
         <w:rPr>
-          <w:rStyle w:val="Overskrift4Tegn"/>
+          <w:rStyle w:val="Heading4Char"/>
           <w:lang w:val="da-DK"/>
         </w:rPr>
         <w:t xml:space="preserve"> NG</w:t>
@@ -2589,7 +2637,7 @@
         <w:rPr>
           <w:lang w:val="da-DK"/>
         </w:rPr>
-        <w:t xml:space="preserve"> udtryk </w:t>
+        <w:t xml:space="preserve"> udtryk</w:t>
       </w:r>
       <w:r>
         <w:rPr>
@@ -2619,13 +2667,19 @@
         <w:rPr>
           <w:lang w:val="da-DK"/>
         </w:rPr>
-        <w:t xml:space="preserve">der </w:t>
-      </w:r>
-      <w:r>
-        <w:rPr>
-          <w:lang w:val="da-DK"/>
-        </w:rPr>
-        <w:t>med en import funktion</w:t>
+        <w:t>systemet</w:t>
+      </w:r>
+      <w:r>
+        <w:rPr>
+          <w:lang w:val="da-DK"/>
+        </w:rPr>
+        <w:t xml:space="preserve"> </w:t>
+      </w:r>
+      <w:r>
+        <w:rPr>
+          <w:lang w:val="da-DK"/>
+        </w:rPr>
+        <w:t>med import funktion</w:t>
       </w:r>
       <w:r>
         <w:rPr>
@@ -2690,7 +2744,7 @@
     </w:p>
     <w:p>
       <w:pPr>
-        <w:pStyle w:val="Listeafsnit"/>
+        <w:pStyle w:val="ListParagraph"/>
         <w:numPr>
           <w:ilvl w:val="0"/>
           <w:numId w:val="36"/>
@@ -2708,7 +2762,7 @@
     </w:p>
     <w:p>
       <w:pPr>
-        <w:pStyle w:val="Listeafsnit"/>
+        <w:pStyle w:val="ListParagraph"/>
         <w:numPr>
           <w:ilvl w:val="1"/>
           <w:numId w:val="36"/>
@@ -2726,7 +2780,7 @@
     </w:p>
     <w:p>
       <w:pPr>
-        <w:pStyle w:val="Listeafsnit"/>
+        <w:pStyle w:val="ListParagraph"/>
         <w:numPr>
           <w:ilvl w:val="1"/>
           <w:numId w:val="36"/>
@@ -2744,7 +2798,7 @@
     </w:p>
     <w:p>
       <w:pPr>
-        <w:pStyle w:val="Listeafsnit"/>
+        <w:pStyle w:val="ListParagraph"/>
         <w:numPr>
           <w:ilvl w:val="1"/>
           <w:numId w:val="36"/>
@@ -2787,7 +2841,7 @@
         <w:rPr>
           <w:lang w:val="da-DK"/>
         </w:rPr>
-        <w:t xml:space="preserve">at resultattabellen </w:t>
+        <w:t xml:space="preserve">resultattabellen </w:t>
       </w:r>
       <w:r>
         <w:rPr>
@@ -2816,7 +2870,7 @@
     </w:p>
     <w:p>
       <w:pPr>
-        <w:pStyle w:val="Listeafsnit"/>
+        <w:pStyle w:val="ListParagraph"/>
         <w:numPr>
           <w:ilvl w:val="0"/>
           <w:numId w:val="36"/>
@@ -2834,7 +2888,7 @@
     </w:p>
     <w:p>
       <w:pPr>
-        <w:pStyle w:val="Listeafsnit"/>
+        <w:pStyle w:val="ListParagraph"/>
         <w:numPr>
           <w:ilvl w:val="1"/>
           <w:numId w:val="36"/>
@@ -2852,7 +2906,7 @@
     </w:p>
     <w:p>
       <w:pPr>
-        <w:pStyle w:val="Listeafsnit"/>
+        <w:pStyle w:val="ListParagraph"/>
         <w:numPr>
           <w:ilvl w:val="1"/>
           <w:numId w:val="36"/>
@@ -2943,7 +2997,19 @@
         <w:rPr>
           <w:lang w:val="da-DK"/>
         </w:rPr>
-        <w:t>B! Grundet denne tabels fysiske størrelse kan det være nødvendigt med indeksering og partitionering af tabellen i multiple</w:t>
+        <w:t xml:space="preserve">B! Grundet denne tabels fysiske størrelse kan det være nødvendigt med </w:t>
+      </w:r>
+      <w:r>
+        <w:rPr>
+          <w:lang w:val="da-DK"/>
+        </w:rPr>
+        <w:t xml:space="preserve">dpeciel </w:t>
+      </w:r>
+      <w:r>
+        <w:rPr>
+          <w:lang w:val="da-DK"/>
+        </w:rPr>
+        <w:t>indeksering og partitionering af tabellen i multiple</w:t>
       </w:r>
       <w:r>
         <w:rPr>
@@ -2972,7 +3038,7 @@
     </w:p>
     <w:p>
       <w:pPr>
-        <w:pStyle w:val="Listeafsnit"/>
+        <w:pStyle w:val="ListParagraph"/>
         <w:numPr>
           <w:ilvl w:val="0"/>
           <w:numId w:val="36"/>
@@ -3002,7 +3068,7 @@
     </w:p>
     <w:p>
       <w:pPr>
-        <w:pStyle w:val="Listeafsnit"/>
+        <w:pStyle w:val="ListParagraph"/>
         <w:numPr>
           <w:ilvl w:val="1"/>
           <w:numId w:val="36"/>
@@ -3062,7 +3128,7 @@
     </w:p>
     <w:p>
       <w:pPr>
-        <w:pStyle w:val="Listeafsnit"/>
+        <w:pStyle w:val="ListParagraph"/>
         <w:numPr>
           <w:ilvl w:val="1"/>
           <w:numId w:val="36"/>
@@ -3170,7 +3236,7 @@
     </w:p>
     <w:p>
       <w:pPr>
-        <w:pStyle w:val="Listeafsnit"/>
+        <w:pStyle w:val="ListParagraph"/>
         <w:numPr>
           <w:ilvl w:val="0"/>
           <w:numId w:val="36"/>
@@ -3200,7 +3266,7 @@
     </w:p>
     <w:p>
       <w:pPr>
-        <w:pStyle w:val="Listeafsnit"/>
+        <w:pStyle w:val="ListParagraph"/>
         <w:numPr>
           <w:ilvl w:val="1"/>
           <w:numId w:val="36"/>
@@ -3356,7 +3422,7 @@
     </w:p>
     <w:p>
       <w:pPr>
-        <w:pStyle w:val="Listeafsnit"/>
+        <w:pStyle w:val="ListParagraph"/>
         <w:numPr>
           <w:ilvl w:val="1"/>
           <w:numId w:val="36"/>
@@ -3374,7 +3440,7 @@
     </w:p>
     <w:p>
       <w:pPr>
-        <w:pStyle w:val="Listeafsnit"/>
+        <w:pStyle w:val="ListParagraph"/>
         <w:numPr>
           <w:ilvl w:val="1"/>
           <w:numId w:val="36"/>
@@ -3399,7 +3465,7 @@
     </w:p>
     <w:p>
       <w:pPr>
-        <w:pStyle w:val="Listeafsnit"/>
+        <w:pStyle w:val="ListParagraph"/>
         <w:numPr>
           <w:ilvl w:val="1"/>
           <w:numId w:val="36"/>
@@ -3508,7 +3574,7 @@
     </w:p>
     <w:p>
       <w:pPr>
-        <w:pStyle w:val="Overskrift4"/>
+        <w:pStyle w:val="Heading4"/>
         <w:rPr>
           <w:lang w:val="da-DK"/>
         </w:rPr>
@@ -3560,31 +3626,13 @@
         <w:rPr>
           <w:lang w:val="da-DK"/>
         </w:rPr>
-        <w:t xml:space="preserve">OS2-Skadesøkonomi system varetages </w:t>
-      </w:r>
-      <w:r>
-        <w:rPr>
-          <w:lang w:val="da-DK"/>
-        </w:rPr>
-        <w:t>d</w:t>
-      </w:r>
-      <w:r>
-        <w:rPr>
-          <w:lang w:val="da-DK"/>
-        </w:rPr>
-        <w:t xml:space="preserve">en </w:t>
-      </w:r>
-      <w:r>
-        <w:rPr>
-          <w:lang w:val="da-DK"/>
-        </w:rPr>
-        <w:t xml:space="preserve">største </w:t>
-      </w:r>
-      <w:r>
-        <w:rPr>
-          <w:lang w:val="da-DK"/>
-        </w:rPr>
-        <w:t xml:space="preserve">del af </w:t>
+        <w:t xml:space="preserve">OS2-Skadesøkonomi system </w:t>
+      </w:r>
+      <w:r>
+        <w:rPr>
+          <w:lang w:val="da-DK"/>
+        </w:rPr>
+        <w:t xml:space="preserve">afhænger en stor del af </w:t>
       </w:r>
       <w:r>
         <w:rPr>
@@ -3608,7 +3656,13 @@
         <w:rPr>
           <w:lang w:val="da-DK"/>
         </w:rPr>
-        <w:t xml:space="preserve">i et </w:t>
+        <w:t>af</w:t>
+      </w:r>
+      <w:r>
+        <w:rPr>
+          <w:lang w:val="da-DK"/>
+        </w:rPr>
+        <w:t xml:space="preserve"> et </w:t>
       </w:r>
       <w:r>
         <w:rPr>
@@ -3716,7 +3770,7 @@
         <w:rPr>
           <w:lang w:val="da-DK"/>
         </w:rPr>
-        <w:t>, da denne udfører for/efterbehandling af modeldata.</w:t>
+        <w:t>.</w:t>
       </w:r>
       <w:r>
         <w:rPr>
@@ -3741,7 +3795,19 @@
         <w:rPr>
           <w:lang w:val="da-DK"/>
         </w:rPr>
-        <w:t>NG versionen</w:t>
+        <w:t>NG</w:t>
+      </w:r>
+      <w:r>
+        <w:rPr>
+          <w:lang w:val="da-DK"/>
+        </w:rPr>
+        <w:t>-</w:t>
+      </w:r>
+      <w:r>
+        <w:rPr>
+          <w:lang w:val="da-DK"/>
+        </w:rPr>
+        <w:t>versionen</w:t>
       </w:r>
       <w:r>
         <w:rPr>
@@ -3862,13 +3928,7 @@
         <w:rPr>
           <w:lang w:val="da-DK"/>
         </w:rPr>
-        <w:t>,</w:t>
-      </w:r>
-      <w:r>
-        <w:rPr>
-          <w:lang w:val="da-DK"/>
-        </w:rPr>
-        <w:t xml:space="preserve"> imperativt</w:t>
+        <w:t>, imperativt</w:t>
       </w:r>
       <w:r>
         <w:rPr>
@@ -3953,7 +4013,7 @@
     </w:p>
     <w:p>
       <w:pPr>
-        <w:pStyle w:val="Overskrift4"/>
+        <w:pStyle w:val="Heading4"/>
         <w:rPr>
           <w:lang w:val="da-DK"/>
         </w:rPr>
@@ -3995,7 +4055,7 @@
         <w:rPr>
           <w:lang w:val="da-DK"/>
         </w:rPr>
-        <w:t>Men til kommunikation til</w:t>
+        <w:t>Men kommunikation til</w:t>
       </w:r>
       <w:r>
         <w:rPr>
@@ -4112,7 +4172,49 @@
         <w:rPr>
           <w:lang w:val="da-DK"/>
         </w:rPr>
-        <w:t xml:space="preserve">bruges til automatisk at oprette et REST-API på basis af tabeller og funktioner defineret i databasen. Endvidere kan oprettede PostgreSQL brugere benyttes </w:t>
+        <w:t xml:space="preserve">bruges til automatisk at oprette et REST-API på basis af tabeller og funktioner defineret i databasen. </w:t>
+      </w:r>
+      <w:r>
+        <w:rPr>
+          <w:lang w:val="da-DK"/>
+        </w:rPr>
+        <w:t xml:space="preserve">Der oprettes endvidere </w:t>
+      </w:r>
+      <w:r>
+        <w:rPr>
+          <w:lang w:val="da-DK"/>
+        </w:rPr>
+        <w:t xml:space="preserve">PostgreSQL </w:t>
+      </w:r>
+      <w:r>
+        <w:rPr>
+          <w:lang w:val="da-DK"/>
+        </w:rPr>
+        <w:t>roller/</w:t>
+      </w:r>
+      <w:r>
+        <w:rPr>
+          <w:lang w:val="da-DK"/>
+        </w:rPr>
+        <w:t>brugere</w:t>
+      </w:r>
+      <w:r>
+        <w:rPr>
+          <w:lang w:val="da-DK"/>
+        </w:rPr>
+        <w:t xml:space="preserve"> som</w:t>
+      </w:r>
+      <w:r>
+        <w:rPr>
+          <w:lang w:val="da-DK"/>
+        </w:rPr>
+        <w:t xml:space="preserve"> benyttes </w:t>
+      </w:r>
+      <w:r>
+        <w:rPr>
+          <w:lang w:val="da-DK"/>
+        </w:rPr>
+        <w:t xml:space="preserve">til </w:t>
       </w:r>
       <w:r>
         <w:rPr>
@@ -4137,7 +4239,19 @@
         <w:rPr>
           <w:lang w:val="da-DK"/>
         </w:rPr>
-        <w:t>Så brugen af PostgRest modulet tilføjer en REST-API protokol til NG-versionen uden større programmeringsindsats.</w:t>
+        <w:t xml:space="preserve">Så brugen af PostgRest modulet tilføjer en REST-API protokol til NG-versionen </w:t>
+      </w:r>
+      <w:r>
+        <w:rPr>
+          <w:lang w:val="da-DK"/>
+        </w:rPr>
+        <w:t>med en moderat</w:t>
+      </w:r>
+      <w:r>
+        <w:rPr>
+          <w:lang w:val="da-DK"/>
+        </w:rPr>
+        <w:t xml:space="preserve"> programmeringsindsats.</w:t>
       </w:r>
     </w:p>
     <w:p>
@@ -4182,7 +4296,19 @@
         <w:rPr>
           <w:lang w:val="da-DK"/>
         </w:rPr>
-        <w:t xml:space="preserve">En modelkørsel resulterer i en semi-temporær tabel i databasen. Denne tabel kan læses via det almene SQL-interface. Alternativt kan det læses </w:t>
+        <w:t xml:space="preserve">En modelkørsel resulterer i en </w:t>
+      </w:r>
+      <w:r>
+        <w:rPr>
+          <w:lang w:val="da-DK"/>
+        </w:rPr>
+        <w:t>”resultat”</w:t>
+      </w:r>
+      <w:r>
+        <w:rPr>
+          <w:lang w:val="da-DK"/>
+        </w:rPr>
+        <w:t xml:space="preserve"> tabel i databasen. Denne tabel kan læses via det almene SQL-interface. Alternativt kan det læses </w:t>
       </w:r>
       <w:r>
         <w:rPr>
@@ -4237,7 +4363,7 @@
     </w:p>
     <w:p>
       <w:pPr>
-        <w:pStyle w:val="Overskrift2"/>
+        <w:pStyle w:val="Heading2"/>
         <w:rPr>
           <w:lang w:val="da-DK"/>
         </w:rPr>
@@ -4357,7 +4483,19 @@
         <w:rPr>
           <w:lang w:val="da-DK"/>
         </w:rPr>
-        <w:t xml:space="preserve"> således evt. nødvendige rettelse</w:t>
+        <w:t xml:space="preserve"> således </w:t>
+      </w:r>
+      <w:r>
+        <w:rPr>
+          <w:lang w:val="da-DK"/>
+        </w:rPr>
+        <w:t>at</w:t>
+      </w:r>
+      <w:r>
+        <w:rPr>
+          <w:lang w:val="da-DK"/>
+        </w:rPr>
+        <w:t xml:space="preserve"> nødvendige rettelse</w:t>
       </w:r>
       <w:r>
         <w:rPr>
@@ -4414,7 +4552,19 @@
         <w:rPr>
           <w:lang w:val="da-DK"/>
         </w:rPr>
-        <w:t xml:space="preserve"> at gennemføre revisionen af OS2-Skadesøkonomi, kan TGV-modulet alligevel nemt integreres i den nuværende udgave af OS2-Skadeøkonomi.  </w:t>
+        <w:t xml:space="preserve"> at gennemføre revisionen af OS2-Skadesøkonomi, kan TGV-modulet </w:t>
+      </w:r>
+      <w:r>
+        <w:rPr>
+          <w:lang w:val="da-DK"/>
+        </w:rPr>
+        <w:t xml:space="preserve">stadigvæk </w:t>
+      </w:r>
+      <w:r>
+        <w:rPr>
+          <w:lang w:val="da-DK"/>
+        </w:rPr>
+        <w:t xml:space="preserve">integreres i den nuværende udgave af OS2-Skadeøkonomi.  </w:t>
       </w:r>
       <w:r>
         <w:rPr>
@@ -4425,7 +4575,7 @@
     </w:p>
     <w:p>
       <w:pPr>
-        <w:pStyle w:val="Overskrift2"/>
+        <w:pStyle w:val="Heading2"/>
         <w:rPr>
           <w:lang w:val="da-DK"/>
         </w:rPr>
@@ -4464,7 +4614,7 @@
     </w:p>
     <w:p>
       <w:pPr>
-        <w:pStyle w:val="Listeafsnit"/>
+        <w:pStyle w:val="ListParagraph"/>
         <w:numPr>
           <w:ilvl w:val="0"/>
           <w:numId w:val="41"/>
@@ -4482,7 +4632,7 @@
     </w:p>
     <w:p>
       <w:pPr>
-        <w:pStyle w:val="Listeafsnit"/>
+        <w:pStyle w:val="ListParagraph"/>
         <w:numPr>
           <w:ilvl w:val="0"/>
           <w:numId w:val="41"/>
@@ -4500,7 +4650,7 @@
     </w:p>
     <w:p>
       <w:pPr>
-        <w:pStyle w:val="Listeafsnit"/>
+        <w:pStyle w:val="ListParagraph"/>
         <w:numPr>
           <w:ilvl w:val="0"/>
           <w:numId w:val="41"/>
@@ -4530,7 +4680,7 @@
     </w:p>
     <w:p>
       <w:pPr>
-        <w:pStyle w:val="Listeafsnit"/>
+        <w:pStyle w:val="ListParagraph"/>
         <w:numPr>
           <w:ilvl w:val="0"/>
           <w:numId w:val="41"/>
@@ -4572,7 +4722,7 @@
     </w:p>
     <w:p>
       <w:pPr>
-        <w:pStyle w:val="Listeafsnit"/>
+        <w:pStyle w:val="ListParagraph"/>
         <w:numPr>
           <w:ilvl w:val="0"/>
           <w:numId w:val="41"/>
@@ -4620,7 +4770,7 @@
     </w:p>
     <w:p>
       <w:pPr>
-        <w:pStyle w:val="Overskrift4"/>
+        <w:pStyle w:val="Heading4"/>
         <w:ind w:left="46"/>
         <w:rPr>
           <w:lang w:val="da-DK"/>
@@ -4641,7 +4791,7 @@
     </w:p>
     <w:p>
       <w:pPr>
-        <w:pStyle w:val="Listeafsnit"/>
+        <w:pStyle w:val="ListParagraph"/>
         <w:numPr>
           <w:ilvl w:val="0"/>
           <w:numId w:val="42"/>
@@ -4659,7 +4809,7 @@
     </w:p>
     <w:p>
       <w:pPr>
-        <w:pStyle w:val="Listeafsnit"/>
+        <w:pStyle w:val="ListParagraph"/>
         <w:numPr>
           <w:ilvl w:val="0"/>
           <w:numId w:val="42"/>
@@ -4689,7 +4839,7 @@
     </w:p>
     <w:p>
       <w:pPr>
-        <w:pStyle w:val="Listeafsnit"/>
+        <w:pStyle w:val="ListParagraph"/>
         <w:numPr>
           <w:ilvl w:val="0"/>
           <w:numId w:val="42"/>
@@ -4713,7 +4863,7 @@
     </w:p>
     <w:p>
       <w:pPr>
-        <w:pStyle w:val="Overskrift4"/>
+        <w:pStyle w:val="Heading4"/>
         <w:rPr>
           <w:lang w:val="da-DK"/>
         </w:rPr>
@@ -4734,7 +4884,7 @@
     </w:p>
     <w:p>
       <w:pPr>
-        <w:pStyle w:val="Listeafsnit"/>
+        <w:pStyle w:val="ListParagraph"/>
         <w:numPr>
           <w:ilvl w:val="0"/>
           <w:numId w:val="40"/>
@@ -4776,7 +4926,7 @@
     </w:p>
     <w:p>
       <w:pPr>
-        <w:pStyle w:val="Listeafsnit"/>
+        <w:pStyle w:val="ListParagraph"/>
         <w:numPr>
           <w:ilvl w:val="0"/>
           <w:numId w:val="21"/>
@@ -4806,7 +4956,7 @@
     </w:p>
     <w:p>
       <w:pPr>
-        <w:pStyle w:val="Overskrift4"/>
+        <w:pStyle w:val="Heading4"/>
         <w:rPr>
           <w:lang w:val="da-DK"/>
         </w:rPr>
@@ -4826,7 +4976,7 @@
     </w:p>
     <w:p>
       <w:pPr>
-        <w:pStyle w:val="Listeafsnit"/>
+        <w:pStyle w:val="ListParagraph"/>
         <w:numPr>
           <w:ilvl w:val="0"/>
           <w:numId w:val="21"/>
@@ -4844,7 +4994,7 @@
     </w:p>
     <w:p>
       <w:pPr>
-        <w:pStyle w:val="Listeafsnit"/>
+        <w:pStyle w:val="ListParagraph"/>
         <w:numPr>
           <w:ilvl w:val="0"/>
           <w:numId w:val="21"/>
@@ -4862,7 +5012,7 @@
     </w:p>
     <w:p>
       <w:pPr>
-        <w:pStyle w:val="Listeafsnit"/>
+        <w:pStyle w:val="ListParagraph"/>
         <w:numPr>
           <w:ilvl w:val="0"/>
           <w:numId w:val="21"/>
@@ -4898,7 +5048,7 @@
     </w:p>
     <w:p>
       <w:pPr>
-        <w:pStyle w:val="Overskrift4"/>
+        <w:pStyle w:val="Heading4"/>
         <w:rPr>
           <w:lang w:val="da-DK"/>
         </w:rPr>
@@ -4918,7 +5068,7 @@
     </w:p>
     <w:p>
       <w:pPr>
-        <w:pStyle w:val="Listeafsnit"/>
+        <w:pStyle w:val="ListParagraph"/>
         <w:numPr>
           <w:ilvl w:val="0"/>
           <w:numId w:val="21"/>
@@ -4936,7 +5086,7 @@
     </w:p>
     <w:p>
       <w:pPr>
-        <w:pStyle w:val="Listeafsnit"/>
+        <w:pStyle w:val="ListParagraph"/>
         <w:numPr>
           <w:ilvl w:val="0"/>
           <w:numId w:val="21"/>
@@ -4978,7 +5128,7 @@
     </w:p>
     <w:p>
       <w:pPr>
-        <w:pStyle w:val="Listeafsnit"/>
+        <w:pStyle w:val="ListParagraph"/>
         <w:numPr>
           <w:ilvl w:val="0"/>
           <w:numId w:val="21"/>
@@ -5002,15 +5152,15 @@
     </w:p>
     <w:p>
       <w:pPr>
-        <w:pStyle w:val="Listeafsnit"/>
-        <w:rPr>
-          <w:lang w:val="da-DK"/>
-        </w:rPr>
-      </w:pPr>
-    </w:p>
-    <w:p>
-      <w:pPr>
-        <w:pStyle w:val="Overskrift4"/>
+        <w:pStyle w:val="ListParagraph"/>
+        <w:rPr>
+          <w:lang w:val="da-DK"/>
+        </w:rPr>
+      </w:pPr>
+    </w:p>
+    <w:p>
+      <w:pPr>
+        <w:pStyle w:val="Heading4"/>
         <w:rPr>
           <w:lang w:val="da-DK"/>
         </w:rPr>
@@ -5030,7 +5180,7 @@
     </w:p>
     <w:p>
       <w:pPr>
-        <w:pStyle w:val="Listeafsnit"/>
+        <w:pStyle w:val="ListParagraph"/>
         <w:numPr>
           <w:ilvl w:val="0"/>
           <w:numId w:val="21"/>
@@ -5049,7 +5199,7 @@
         <w:rPr>
           <w:lang w:val="da-DK"/>
         </w:rPr>
-        <w:t xml:space="preserve"> /  cellelag </w:t>
+        <w:t xml:space="preserve"> / cellelag </w:t>
       </w:r>
       <w:r>
         <w:rPr>
@@ -5067,7 +5217,19 @@
         <w:rPr>
           <w:lang w:val="da-DK"/>
         </w:rPr>
-        <w:t>rådata kan konverteres og importeres til NG-versionens sektorlag</w:t>
+        <w:t xml:space="preserve">rådata kan importeres </w:t>
+      </w:r>
+      <w:r>
+        <w:rPr>
+          <w:lang w:val="da-DK"/>
+        </w:rPr>
+        <w:t xml:space="preserve">og under importen konverteres </w:t>
+      </w:r>
+      <w:r>
+        <w:rPr>
+          <w:lang w:val="da-DK"/>
+        </w:rPr>
+        <w:t>til NG-versionens sektorlag</w:t>
       </w:r>
       <w:r>
         <w:rPr>
@@ -5078,7 +5240,7 @@
     </w:p>
     <w:p>
       <w:pPr>
-        <w:pStyle w:val="Listeafsnit"/>
+        <w:pStyle w:val="ListParagraph"/>
         <w:numPr>
           <w:ilvl w:val="0"/>
           <w:numId w:val="21"/>
@@ -5091,7 +5253,19 @@
         <w:rPr>
           <w:lang w:val="da-DK"/>
         </w:rPr>
-        <w:t xml:space="preserve">Eksisterende importfunktioner til rasterdato o.lign. bibeholdes </w:t>
+        <w:t xml:space="preserve">Eksisterende importfunktioner til rasterdato o.lign. </w:t>
+      </w:r>
+      <w:r>
+        <w:rPr>
+          <w:lang w:val="da-DK"/>
+        </w:rPr>
+        <w:t>skal tilpasses de nye strukturer.</w:t>
+      </w:r>
+      <w:r>
+        <w:rPr>
+          <w:lang w:val="da-DK"/>
+        </w:rPr>
+        <w:t xml:space="preserve"> </w:t>
       </w:r>
       <w:r>
         <w:rPr>
@@ -5102,7 +5276,7 @@
     </w:p>
     <w:p>
       <w:pPr>
-        <w:pStyle w:val="Overskrift4"/>
+        <w:pStyle w:val="Heading4"/>
         <w:rPr>
           <w:lang w:val="da-DK"/>
         </w:rPr>
@@ -5128,7 +5302,7 @@
     </w:p>
     <w:p>
       <w:pPr>
-        <w:pStyle w:val="Listeafsnit"/>
+        <w:pStyle w:val="ListParagraph"/>
         <w:numPr>
           <w:ilvl w:val="0"/>
           <w:numId w:val="21"/>
@@ -5165,7 +5339,7 @@
         <w:rPr>
           <w:lang w:val="da-DK"/>
         </w:rPr>
-        <w:t xml:space="preserve"> i databasen – således at databehandling og modelberegninger kun afhænger af data </w:t>
+        <w:t xml:space="preserve"> i databasen – således databehandling og modelberegninger kun afhænger af data </w:t>
       </w:r>
       <w:r>
         <w:rPr>
@@ -5184,7 +5358,7 @@
     </w:p>
     <w:p>
       <w:pPr>
-        <w:pStyle w:val="Listeafsnit"/>
+        <w:pStyle w:val="ListParagraph"/>
         <w:numPr>
           <w:ilvl w:val="0"/>
           <w:numId w:val="21"/>
@@ -5220,7 +5394,7 @@
     </w:p>
     <w:p>
       <w:pPr>
-        <w:pStyle w:val="Overskrift4"/>
+        <w:pStyle w:val="Heading4"/>
         <w:rPr>
           <w:lang w:val="da-DK"/>
         </w:rPr>
@@ -5240,7 +5414,7 @@
     </w:p>
     <w:p>
       <w:pPr>
-        <w:pStyle w:val="Listeafsnit"/>
+        <w:pStyle w:val="ListParagraph"/>
         <w:numPr>
           <w:ilvl w:val="0"/>
           <w:numId w:val="43"/>
@@ -5288,7 +5462,7 @@
     </w:p>
     <w:p>
       <w:pPr>
-        <w:pStyle w:val="Overskrift4"/>
+        <w:pStyle w:val="Heading4"/>
         <w:rPr>
           <w:lang w:val="da-DK"/>
         </w:rPr>
@@ -5308,25 +5482,25 @@
     </w:p>
     <w:p>
       <w:pPr>
-        <w:pStyle w:val="Listeafsnit"/>
+        <w:pStyle w:val="ListParagraph"/>
         <w:numPr>
           <w:ilvl w:val="0"/>
           <w:numId w:val="21"/>
         </w:numPr>
         <w:rPr>
-          <w:lang w:val="da-DK"/>
-        </w:rPr>
-      </w:pPr>
-      <w:r>
-        <w:rPr>
-          <w:lang w:val="da-DK"/>
+          <w:lang w:val="en-US"/>
+        </w:rPr>
+      </w:pPr>
+      <w:r>
+        <w:rPr>
+          <w:lang w:val="en-US"/>
         </w:rPr>
         <w:t>REST-API opsættes vha. PostgRest REST-API generator.</w:t>
       </w:r>
     </w:p>
     <w:p>
       <w:pPr>
-        <w:pStyle w:val="Listeafsnit"/>
+        <w:pStyle w:val="ListParagraph"/>
         <w:numPr>
           <w:ilvl w:val="0"/>
           <w:numId w:val="21"/>
@@ -5344,7 +5518,7 @@
     </w:p>
     <w:p>
       <w:pPr>
-        <w:pStyle w:val="Overskrift4"/>
+        <w:pStyle w:val="Heading4"/>
         <w:rPr>
           <w:lang w:val="da-DK"/>
         </w:rPr>
@@ -5371,7 +5545,7 @@
     </w:p>
     <w:p>
       <w:pPr>
-        <w:pStyle w:val="Listeafsnit"/>
+        <w:pStyle w:val="ListParagraph"/>
         <w:numPr>
           <w:ilvl w:val="0"/>
           <w:numId w:val="21"/>
@@ -5431,7 +5605,7 @@
     </w:p>
     <w:p>
       <w:pPr>
-        <w:pStyle w:val="Listeafsnit"/>
+        <w:pStyle w:val="ListParagraph"/>
         <w:numPr>
           <w:ilvl w:val="0"/>
           <w:numId w:val="21"/>
@@ -5468,7 +5642,7 @@
     </w:p>
     <w:p>
       <w:pPr>
-        <w:pStyle w:val="Overskrift4"/>
+        <w:pStyle w:val="Heading4"/>
         <w:rPr>
           <w:lang w:val="da-DK"/>
         </w:rPr>
@@ -5488,7 +5662,7 @@
     </w:p>
     <w:p>
       <w:pPr>
-        <w:pStyle w:val="Listeafsnit"/>
+        <w:pStyle w:val="ListParagraph"/>
         <w:numPr>
           <w:ilvl w:val="0"/>
           <w:numId w:val="21"/>
@@ -5518,7 +5692,7 @@
     </w:p>
     <w:p>
       <w:pPr>
-        <w:pStyle w:val="Overskrift2"/>
+        <w:pStyle w:val="Heading2"/>
         <w:rPr>
           <w:lang w:val="da-DK"/>
         </w:rPr>
@@ -5583,11 +5757,9 @@
       </w:r>
       <w:r>
         <w:rPr>
-          <w:i/>
-          <w:iCs/>
-          <w:lang w:val="da-DK"/>
-        </w:rPr>
-        <w:t xml:space="preserve">”slag på tasken” </w:t>
+          <w:lang w:val="da-DK"/>
+        </w:rPr>
+        <w:t xml:space="preserve">løst </w:t>
       </w:r>
       <w:r>
         <w:rPr>
@@ -5599,19 +5771,31 @@
         <w:rPr>
           <w:lang w:val="da-DK"/>
         </w:rPr>
-        <w:t xml:space="preserve">er i omegnen af 300.000 kr. – fordelt på 150.000 til omlægning af database og funktioner, </w:t>
-      </w:r>
-      <w:r>
-        <w:rPr>
-          <w:lang w:val="da-DK"/>
-        </w:rPr>
-        <w:t>75</w:t>
-      </w:r>
-      <w:r>
-        <w:rPr>
-          <w:lang w:val="da-DK"/>
-        </w:rPr>
-        <w:t>.000 kr. på omskrivning af QGIS</w:t>
+        <w:t xml:space="preserve">er i omegnen af 300.000 kr. – fordelt på </w:t>
+      </w:r>
+      <w:r>
+        <w:rPr>
+          <w:lang w:val="da-DK"/>
+        </w:rPr>
+        <w:t xml:space="preserve">50% </w:t>
+      </w:r>
+      <w:r>
+        <w:rPr>
+          <w:lang w:val="da-DK"/>
+        </w:rPr>
+        <w:t xml:space="preserve">til omlægning af database og funktioner, </w:t>
+      </w:r>
+      <w:r>
+        <w:rPr>
+          <w:lang w:val="da-DK"/>
+        </w:rPr>
+        <w:t xml:space="preserve">25 % </w:t>
+      </w:r>
+      <w:r>
+        <w:rPr>
+          <w:lang w:val="da-DK"/>
+        </w:rPr>
+        <w:t>på omskrivning af QGIS</w:t>
       </w:r>
       <w:r>
         <w:rPr>
@@ -5629,7 +5813,13 @@
         <w:rPr>
           <w:lang w:val="da-DK"/>
         </w:rPr>
-        <w:t xml:space="preserve">75.000 kr. på opsætning af REST-API med PostgRest og bruger-rolle opsætning. </w:t>
+        <w:t xml:space="preserve">25 % </w:t>
+      </w:r>
+      <w:r>
+        <w:rPr>
+          <w:lang w:val="da-DK"/>
+        </w:rPr>
+        <w:t xml:space="preserve">kr. på opsætning af REST-API med PostgRest og bruger-rolle opsætning. </w:t>
       </w:r>
     </w:p>
     <w:p>
@@ -5742,7 +5932,7 @@
     <w:sdtContent>
       <w:p>
         <w:pPr>
-          <w:pStyle w:val="Sidefod"/>
+          <w:pStyle w:val="Footer"/>
           <w:jc w:val="right"/>
         </w:pPr>
         <w:r>
@@ -5771,7 +5961,7 @@
   </w:sdt>
   <w:p>
     <w:pPr>
-      <w:pStyle w:val="Sidefod"/>
+      <w:pStyle w:val="Footer"/>
     </w:pPr>
   </w:p>
 </w:ftr>
@@ -5806,7 +5996,7 @@
 <w:hdr xmlns:wpc="http://schemas.microsoft.com/office/word/2010/wordprocessingCanvas" xmlns:cx="http://schemas.microsoft.com/office/drawing/2014/chartex" xmlns:cx1="http://schemas.microsoft.com/office/drawing/2015/9/8/chartex" xmlns:cx2="http://schemas.microsoft.com/office/drawing/2015/10/21/chartex" xmlns:cx3="http://schemas.microsoft.com/office/drawing/2016/5/9/chartex" xmlns:cx4="http://schemas.microsoft.com/office/drawing/2016/5/10/chartex" xmlns:cx5="http://schemas.microsoft.com/office/drawing/2016/5/11/chartex" xmlns:cx6="http://schemas.microsoft.com/office/drawing/2016/5/12/chartex" xmlns:cx7="http://schemas.microsoft.com/office/drawing/2016/5/13/chartex" xmlns:cx8="http://schemas.microsoft.com/office/drawing/2016/5/14/chartex" xmlns:mc="http://schemas.openxmlformats.org/markup-compatibility/2006" xmlns:aink="http://schemas.microsoft.com/office/drawing/2016/ink" xmlns:am3d="http://schemas.microsoft.com/office/drawing/2017/model3d" xmlns:o="urn:schemas-microsoft-com:office:office" xmlns:oel="http://schemas.microsoft.com/office/2019/extlst" xmlns:r="http://schemas.openxmlformats.org/officeDocument/2006/relationships" xmlns:m="http://schemas.openxmlformats.org/officeDocument/2006/math" xmlns:v="urn:schemas-microsoft-com:vml" xmlns:wp14="http://schemas.microsoft.com/office/word/2010/wordprocessingDrawing" xmlns:wp="http://schemas.openxmlformats.org/drawingml/2006/wordprocessingDrawing" xmlns:w10="urn:schemas-microsoft-com:office:word" xmlns:w="http://schemas.openxmlformats.org/wordprocessingml/2006/main" xmlns:w14="http://schemas.microsoft.com/office/word/2010/wordml" xmlns:w15="http://schemas.microsoft.com/office/word/2012/wordml" xmlns:w16cex="http://schemas.microsoft.com/office/word/2018/wordml/cex" xmlns:w16cid="http://schemas.microsoft.com/office/word/2016/wordml/cid" xmlns:w16="http://schemas.microsoft.com/office/word/2018/wordml" xmlns:w16du="http://schemas.microsoft.com/office/word/2023/wordml/word16du" xmlns:w16sdtdh="http://schemas.microsoft.com/office/word/2020/wordml/sdtdatahash" xmlns:w16sdtfl="http://schemas.microsoft.com/office/word/2024/wordml/sdtformatlock" xmlns:w16se="http://schemas.microsoft.com/office/word/2015/wordml/symex" xmlns:wpg="http://schemas.microsoft.com/office/word/2010/wordprocessingGroup" xmlns:wpi="http://schemas.microsoft.com/office/word/2010/wordprocessingInk" xmlns:wne="http://schemas.microsoft.com/office/word/2006/wordml" xmlns:wps="http://schemas.microsoft.com/office/word/2010/wordprocessingShape" mc:Ignorable="w14 w15 w16se w16cid w16 w16cex w16sdtdh w16sdtfl w16du wp14">
   <w:p>
     <w:pPr>
-      <w:pStyle w:val="Sidehoved"/>
+      <w:pStyle w:val="Header"/>
     </w:pPr>
     <w:r>
       <w:rPr>
@@ -5888,7 +6078,7 @@
     <w:lvl w:ilvl="0">
       <w:start w:val="1"/>
       <w:numFmt w:val="decimal"/>
-      <w:pStyle w:val="Opstilling-talellerbogst"/>
+      <w:pStyle w:val="ListNumber"/>
       <w:lvlText w:val="%1."/>
       <w:lvlJc w:val="left"/>
       <w:pPr>
@@ -5906,7 +6096,7 @@
     <w:lvl w:ilvl="0">
       <w:start w:val="1"/>
       <w:numFmt w:val="bullet"/>
-      <w:pStyle w:val="Opstilling-punkttegn"/>
+      <w:pStyle w:val="ListBullet"/>
       <w:lvlText w:val=""/>
       <w:lvlJc w:val="left"/>
       <w:pPr>
@@ -10717,11 +10907,11 @@
     <w:name w:val="Normal"/>
     <w:qFormat/>
   </w:style>
-  <w:style w:type="paragraph" w:styleId="Overskrift1">
+  <w:style w:type="paragraph" w:styleId="Heading1">
     <w:name w:val="heading 1"/>
     <w:basedOn w:val="Normal"/>
     <w:next w:val="Normal"/>
-    <w:link w:val="Overskrift1Tegn"/>
+    <w:link w:val="Heading1Char"/>
     <w:uiPriority w:val="9"/>
     <w:qFormat/>
     <w:rsid w:val="00536108"/>
@@ -10738,11 +10928,11 @@
       <w:szCs w:val="32"/>
     </w:rPr>
   </w:style>
-  <w:style w:type="paragraph" w:styleId="Overskrift2">
+  <w:style w:type="paragraph" w:styleId="Heading2">
     <w:name w:val="heading 2"/>
     <w:basedOn w:val="Normal"/>
     <w:next w:val="Normal"/>
-    <w:link w:val="Overskrift2Tegn"/>
+    <w:link w:val="Heading2Char"/>
     <w:uiPriority w:val="9"/>
     <w:unhideWhenUsed/>
     <w:qFormat/>
@@ -10760,11 +10950,11 @@
       <w:szCs w:val="26"/>
     </w:rPr>
   </w:style>
-  <w:style w:type="paragraph" w:styleId="Overskrift3">
+  <w:style w:type="paragraph" w:styleId="Heading3">
     <w:name w:val="heading 3"/>
     <w:basedOn w:val="Normal"/>
     <w:next w:val="Normal"/>
-    <w:link w:val="Overskrift3Tegn"/>
+    <w:link w:val="Heading3Char"/>
     <w:uiPriority w:val="9"/>
     <w:unhideWhenUsed/>
     <w:qFormat/>
@@ -10782,11 +10972,11 @@
       <w:szCs w:val="24"/>
     </w:rPr>
   </w:style>
-  <w:style w:type="paragraph" w:styleId="Overskrift4">
+  <w:style w:type="paragraph" w:styleId="Heading4">
     <w:name w:val="heading 4"/>
     <w:basedOn w:val="Normal"/>
     <w:next w:val="Normal"/>
-    <w:link w:val="Overskrift4Tegn"/>
+    <w:link w:val="Heading4Char"/>
     <w:uiPriority w:val="9"/>
     <w:unhideWhenUsed/>
     <w:qFormat/>
@@ -10804,13 +10994,13 @@
       <w:color w:val="2F5496" w:themeColor="accent1" w:themeShade="BF"/>
     </w:rPr>
   </w:style>
-  <w:style w:type="character" w:default="1" w:styleId="Standardskrifttypeiafsnit">
+  <w:style w:type="character" w:default="1" w:styleId="DefaultParagraphFont">
     <w:name w:val="Default Paragraph Font"/>
     <w:uiPriority w:val="1"/>
     <w:semiHidden/>
     <w:unhideWhenUsed/>
   </w:style>
-  <w:style w:type="table" w:default="1" w:styleId="Tabel-Normal">
+  <w:style w:type="table" w:default="1" w:styleId="TableNormal">
     <w:name w:val="Normal Table"/>
     <w:uiPriority w:val="99"/>
     <w:semiHidden/>
@@ -10825,16 +11015,16 @@
       </w:tblCellMar>
     </w:tblPr>
   </w:style>
-  <w:style w:type="numbering" w:default="1" w:styleId="Ingenoversigt">
+  <w:style w:type="numbering" w:default="1" w:styleId="NoList">
     <w:name w:val="No List"/>
     <w:uiPriority w:val="99"/>
     <w:semiHidden/>
     <w:unhideWhenUsed/>
   </w:style>
-  <w:style w:type="character" w:customStyle="1" w:styleId="Overskrift1Tegn">
-    <w:name w:val="Overskrift 1 Tegn"/>
-    <w:basedOn w:val="Standardskrifttypeiafsnit"/>
-    <w:link w:val="Overskrift1"/>
+  <w:style w:type="character" w:customStyle="1" w:styleId="Heading1Char">
+    <w:name w:val="Heading 1 Char"/>
+    <w:basedOn w:val="DefaultParagraphFont"/>
+    <w:link w:val="Heading1"/>
     <w:uiPriority w:val="9"/>
     <w:rsid w:val="00536108"/>
     <w:rPr>
@@ -10844,9 +11034,9 @@
       <w:szCs w:val="32"/>
     </w:rPr>
   </w:style>
-  <w:style w:type="character" w:styleId="Strk">
+  <w:style w:type="character" w:styleId="Strong">
     <w:name w:val="Strong"/>
-    <w:basedOn w:val="Standardskrifttypeiafsnit"/>
+    <w:basedOn w:val="DefaultParagraphFont"/>
     <w:uiPriority w:val="22"/>
     <w:qFormat/>
     <w:rsid w:val="00536108"/>
@@ -10855,10 +11045,10 @@
       <w:bCs/>
     </w:rPr>
   </w:style>
-  <w:style w:type="character" w:customStyle="1" w:styleId="Overskrift2Tegn">
-    <w:name w:val="Overskrift 2 Tegn"/>
-    <w:basedOn w:val="Standardskrifttypeiafsnit"/>
-    <w:link w:val="Overskrift2"/>
+  <w:style w:type="character" w:customStyle="1" w:styleId="Heading2Char">
+    <w:name w:val="Heading 2 Char"/>
+    <w:basedOn w:val="DefaultParagraphFont"/>
+    <w:link w:val="Heading2"/>
     <w:uiPriority w:val="9"/>
     <w:rsid w:val="00536108"/>
     <w:rPr>
@@ -10868,9 +11058,9 @@
       <w:szCs w:val="26"/>
     </w:rPr>
   </w:style>
-  <w:style w:type="character" w:styleId="Kraftigfremhvning">
+  <w:style w:type="character" w:styleId="IntenseEmphasis">
     <w:name w:val="Intense Emphasis"/>
-    <w:basedOn w:val="Standardskrifttypeiafsnit"/>
+    <w:basedOn w:val="DefaultParagraphFont"/>
     <w:uiPriority w:val="21"/>
     <w:qFormat/>
     <w:rsid w:val="00536108"/>
@@ -10880,7 +11070,7 @@
       <w:color w:val="4472C4" w:themeColor="accent1"/>
     </w:rPr>
   </w:style>
-  <w:style w:type="paragraph" w:styleId="Listeafsnit">
+  <w:style w:type="paragraph" w:styleId="ListParagraph">
     <w:name w:val="List Paragraph"/>
     <w:basedOn w:val="Normal"/>
     <w:uiPriority w:val="34"/>
@@ -10891,10 +11081,10 @@
       <w:contextualSpacing/>
     </w:pPr>
   </w:style>
-  <w:style w:type="paragraph" w:styleId="Sidehoved">
+  <w:style w:type="paragraph" w:styleId="Header">
     <w:name w:val="header"/>
     <w:basedOn w:val="Normal"/>
-    <w:link w:val="SidehovedTegn"/>
+    <w:link w:val="HeaderChar"/>
     <w:uiPriority w:val="99"/>
     <w:unhideWhenUsed/>
     <w:rsid w:val="004B2451"/>
@@ -10906,17 +11096,17 @@
       <w:spacing w:after="0" w:line="240" w:lineRule="auto"/>
     </w:pPr>
   </w:style>
-  <w:style w:type="character" w:customStyle="1" w:styleId="SidehovedTegn">
-    <w:name w:val="Sidehoved Tegn"/>
-    <w:basedOn w:val="Standardskrifttypeiafsnit"/>
-    <w:link w:val="Sidehoved"/>
+  <w:style w:type="character" w:customStyle="1" w:styleId="HeaderChar">
+    <w:name w:val="Header Char"/>
+    <w:basedOn w:val="DefaultParagraphFont"/>
+    <w:link w:val="Header"/>
     <w:uiPriority w:val="99"/>
     <w:rsid w:val="004B2451"/>
   </w:style>
-  <w:style w:type="paragraph" w:styleId="Sidefod">
+  <w:style w:type="paragraph" w:styleId="Footer">
     <w:name w:val="footer"/>
     <w:basedOn w:val="Normal"/>
-    <w:link w:val="SidefodTegn"/>
+    <w:link w:val="FooterChar"/>
     <w:uiPriority w:val="99"/>
     <w:unhideWhenUsed/>
     <w:rsid w:val="004B2451"/>
@@ -10928,14 +11118,14 @@
       <w:spacing w:after="0" w:line="240" w:lineRule="auto"/>
     </w:pPr>
   </w:style>
-  <w:style w:type="character" w:customStyle="1" w:styleId="SidefodTegn">
-    <w:name w:val="Sidefod Tegn"/>
-    <w:basedOn w:val="Standardskrifttypeiafsnit"/>
-    <w:link w:val="Sidefod"/>
+  <w:style w:type="character" w:customStyle="1" w:styleId="FooterChar">
+    <w:name w:val="Footer Char"/>
+    <w:basedOn w:val="DefaultParagraphFont"/>
+    <w:link w:val="Footer"/>
     <w:uiPriority w:val="99"/>
     <w:rsid w:val="004B2451"/>
   </w:style>
-  <w:style w:type="paragraph" w:styleId="Ingenafstand">
+  <w:style w:type="paragraph" w:styleId="NoSpacing">
     <w:name w:val="No Spacing"/>
     <w:uiPriority w:val="1"/>
     <w:qFormat/>
@@ -10944,7 +11134,7 @@
       <w:spacing w:after="0" w:line="240" w:lineRule="auto"/>
     </w:pPr>
   </w:style>
-  <w:style w:type="paragraph" w:styleId="Opstilling-punkttegn">
+  <w:style w:type="paragraph" w:styleId="ListBullet">
     <w:name w:val="List Bullet"/>
     <w:basedOn w:val="Normal"/>
     <w:uiPriority w:val="99"/>
@@ -10957,7 +11147,7 @@
       <w:contextualSpacing/>
     </w:pPr>
   </w:style>
-  <w:style w:type="paragraph" w:styleId="Opstilling-talellerbogst">
+  <w:style w:type="paragraph" w:styleId="ListNumber">
     <w:name w:val="List Number"/>
     <w:basedOn w:val="Normal"/>
     <w:uiPriority w:val="99"/>
@@ -10970,11 +11160,11 @@
       <w:contextualSpacing/>
     </w:pPr>
   </w:style>
-  <w:style w:type="paragraph" w:styleId="Titel">
+  <w:style w:type="paragraph" w:styleId="Title">
     <w:name w:val="Title"/>
     <w:basedOn w:val="Normal"/>
     <w:next w:val="Normal"/>
-    <w:link w:val="TitelTegn"/>
+    <w:link w:val="TitleChar"/>
     <w:uiPriority w:val="10"/>
     <w:qFormat/>
     <w:rsid w:val="007F3459"/>
@@ -10990,10 +11180,10 @@
       <w:szCs w:val="56"/>
     </w:rPr>
   </w:style>
-  <w:style w:type="character" w:customStyle="1" w:styleId="TitelTegn">
-    <w:name w:val="Titel Tegn"/>
-    <w:basedOn w:val="Standardskrifttypeiafsnit"/>
-    <w:link w:val="Titel"/>
+  <w:style w:type="character" w:customStyle="1" w:styleId="TitleChar">
+    <w:name w:val="Title Char"/>
+    <w:basedOn w:val="DefaultParagraphFont"/>
+    <w:link w:val="Title"/>
     <w:uiPriority w:val="10"/>
     <w:rsid w:val="007F3459"/>
     <w:rPr>
@@ -11004,9 +11194,9 @@
       <w:szCs w:val="56"/>
     </w:rPr>
   </w:style>
-  <w:style w:type="character" w:styleId="Fremhv">
+  <w:style w:type="character" w:styleId="Emphasis">
     <w:name w:val="Emphasis"/>
-    <w:basedOn w:val="Standardskrifttypeiafsnit"/>
+    <w:basedOn w:val="DefaultParagraphFont"/>
     <w:uiPriority w:val="20"/>
     <w:qFormat/>
     <w:rsid w:val="005F3318"/>
@@ -11015,9 +11205,9 @@
       <w:iCs/>
     </w:rPr>
   </w:style>
-  <w:style w:type="character" w:styleId="Svagfremhvning">
+  <w:style w:type="character" w:styleId="SubtleEmphasis">
     <w:name w:val="Subtle Emphasis"/>
-    <w:basedOn w:val="Standardskrifttypeiafsnit"/>
+    <w:basedOn w:val="DefaultParagraphFont"/>
     <w:uiPriority w:val="19"/>
     <w:qFormat/>
     <w:rsid w:val="005F3318"/>
@@ -11027,11 +11217,11 @@
       <w:color w:val="404040" w:themeColor="text1" w:themeTint="BF"/>
     </w:rPr>
   </w:style>
-  <w:style w:type="paragraph" w:styleId="Undertitel">
+  <w:style w:type="paragraph" w:styleId="Subtitle">
     <w:name w:val="Subtitle"/>
     <w:basedOn w:val="Normal"/>
     <w:next w:val="Normal"/>
-    <w:link w:val="UndertitelTegn"/>
+    <w:link w:val="SubtitleChar"/>
     <w:uiPriority w:val="11"/>
     <w:qFormat/>
     <w:rsid w:val="005F3318"/>
@@ -11046,10 +11236,10 @@
       <w:spacing w:val="15"/>
     </w:rPr>
   </w:style>
-  <w:style w:type="character" w:customStyle="1" w:styleId="UndertitelTegn">
-    <w:name w:val="Undertitel Tegn"/>
-    <w:basedOn w:val="Standardskrifttypeiafsnit"/>
-    <w:link w:val="Undertitel"/>
+  <w:style w:type="character" w:customStyle="1" w:styleId="SubtitleChar">
+    <w:name w:val="Subtitle Char"/>
+    <w:basedOn w:val="DefaultParagraphFont"/>
+    <w:link w:val="Subtitle"/>
     <w:uiPriority w:val="11"/>
     <w:rsid w:val="005F3318"/>
     <w:rPr>
@@ -11058,10 +11248,10 @@
       <w:spacing w:val="15"/>
     </w:rPr>
   </w:style>
-  <w:style w:type="character" w:customStyle="1" w:styleId="Overskrift3Tegn">
-    <w:name w:val="Overskrift 3 Tegn"/>
-    <w:basedOn w:val="Standardskrifttypeiafsnit"/>
-    <w:link w:val="Overskrift3"/>
+  <w:style w:type="character" w:customStyle="1" w:styleId="Heading3Char">
+    <w:name w:val="Heading 3 Char"/>
+    <w:basedOn w:val="DefaultParagraphFont"/>
+    <w:link w:val="Heading3"/>
     <w:uiPriority w:val="9"/>
     <w:rsid w:val="005F3318"/>
     <w:rPr>
@@ -11071,11 +11261,11 @@
       <w:szCs w:val="24"/>
     </w:rPr>
   </w:style>
-  <w:style w:type="paragraph" w:styleId="Citat">
+  <w:style w:type="paragraph" w:styleId="Quote">
     <w:name w:val="Quote"/>
     <w:basedOn w:val="Normal"/>
     <w:next w:val="Normal"/>
-    <w:link w:val="CitatTegn"/>
+    <w:link w:val="QuoteChar"/>
     <w:uiPriority w:val="29"/>
     <w:qFormat/>
     <w:rsid w:val="00375F63"/>
@@ -11090,10 +11280,10 @@
       <w:color w:val="404040" w:themeColor="text1" w:themeTint="BF"/>
     </w:rPr>
   </w:style>
-  <w:style w:type="character" w:customStyle="1" w:styleId="CitatTegn">
-    <w:name w:val="Citat Tegn"/>
-    <w:basedOn w:val="Standardskrifttypeiafsnit"/>
-    <w:link w:val="Citat"/>
+  <w:style w:type="character" w:customStyle="1" w:styleId="QuoteChar">
+    <w:name w:val="Quote Char"/>
+    <w:basedOn w:val="DefaultParagraphFont"/>
+    <w:link w:val="Quote"/>
     <w:uiPriority w:val="29"/>
     <w:rsid w:val="00375F63"/>
     <w:rPr>
@@ -11102,9 +11292,9 @@
       <w:color w:val="404040" w:themeColor="text1" w:themeTint="BF"/>
     </w:rPr>
   </w:style>
-  <w:style w:type="character" w:styleId="Bogenstitel">
+  <w:style w:type="character" w:styleId="BookTitle">
     <w:name w:val="Book Title"/>
-    <w:basedOn w:val="Standardskrifttypeiafsnit"/>
+    <w:basedOn w:val="DefaultParagraphFont"/>
     <w:uiPriority w:val="33"/>
     <w:qFormat/>
     <w:rsid w:val="00D07C79"/>
@@ -11116,10 +11306,10 @@
       <w:spacing w:val="5"/>
     </w:rPr>
   </w:style>
-  <w:style w:type="character" w:customStyle="1" w:styleId="Overskrift4Tegn">
-    <w:name w:val="Overskrift 4 Tegn"/>
-    <w:basedOn w:val="Standardskrifttypeiafsnit"/>
-    <w:link w:val="Overskrift4"/>
+  <w:style w:type="character" w:customStyle="1" w:styleId="Heading4Char">
+    <w:name w:val="Heading 4 Char"/>
+    <w:basedOn w:val="DefaultParagraphFont"/>
+    <w:link w:val="Heading4"/>
     <w:uiPriority w:val="9"/>
     <w:rsid w:val="003647CB"/>
     <w:rPr>

</xml_diff>